<commit_message>
Report: X3, X4, X7 results; Part G flow count; task-list references removed from src
</commit_message>
<xml_diff>
--- a/report/Mini_Project_Report.docx
+++ b/report/Mini_Project_Report.docx
@@ -4120,7 +4120,20 @@
         <w:rPr>
           <w:sz w:val="20"/>
         </w:rPr>
-        <w:t xml:space="preserve">, 0.011 for the tree and 0.066 for logistic regression.</w:t>
+        <w:t xml:space="preserve">, 0.011 for the tree and 0.066 for logistic regression. A greedy attack search in the separate notebook, allowed only changes the attacker controls, needs even less: one change to </w:t>
+      </w:r>
+      <w:r>
+        <w:rPr>
+          <w:rFonts w:ascii="Consolas" w:hAnsi="Consolas"/>
+          <w:sz w:val="20"/>
+        </w:rPr>
+        <w:t xml:space="preserve">Fwd Seg Size Min</w:t>
+      </w:r>
+      <w:r>
+        <w:rPr>
+          <w:sz w:val="20"/>
+        </w:rPr>
+        <w:t xml:space="preserve"> evades boosting for all 50 attacks it tried.</w:t>
       </w:r>
     </w:p>
     <w:p>
@@ -4332,7 +4345,7 @@
         <w:rPr>
           <w:sz w:val="20"/>
         </w:rPr>
-        <w:t xml:space="preserve">. We would watch the share of uncertain predictions (it nearly doubled here, and needs no labels), compare incoming feature distributions with the training data, have analysts label a small random sample every week (including flows called benign), and retrain regularly.</w:t>
+        <w:t xml:space="preserve">. We would watch the share of uncertain predictions (it nearly doubled here, and needs no labels), compare incoming feature distributions with the training data, have analysts label a small random sample every week (including flows called benign), and retrain regularly. A learning curve in the separate notebook shows how far labels go: 500 labels weighted 100 times reach 0.956 (FAR 0.027, the original model's level), and 25 weighted labels already beat 250 unweighted ones.</w:t>
       </w:r>
     </w:p>
     <w:p>
@@ -4492,7 +4505,7 @@
         <w:rPr>
           <w:sz w:val="20"/>
         </w:rPr>
-        <w:t xml:space="preserve"> missing, Unknown rose to 0.43 and the utility became a range, 16.9 to 59.6, that spans the threshold: the honest answer "cannot decide". It also survives noise far better: at noise 0.05 its macro-F1 is 0.897, against 0.472 for the 2-feature tree and 0.536 for the forest. The costs: lower accuracy, only two features (rules grow as 3 to the power of the number of features), hand-made choices of levels and threshold, and an Unknown that only helps if undecided flows go to an analyst.</w:t>
+        <w:t xml:space="preserve"> missing, Unknown rose to 0.43 and the utility became a range, 16.9 to 59.6, that spans the threshold: the honest answer "cannot decide". It also survives noise far better: at noise 0.05 its macro-F1 is 0.897, against 0.472 for the 2-feature tree and 0.536 for the forest. The costs: lower accuracy, only two features (rules grow as 3 to the power of the number of features), hand-made choices of levels and threshold, and an Unknown that only helps if undecided flows go to an analyst. On the whole test set (separate notebook), a missing window leaves the BRB unable to decide 65% of the flows, while boosting, given the median instead, misses 79% of the attacks with no sign of doubt.</w:t>
       </w:r>
     </w:p>
     <w:p>
@@ -4513,7 +4526,7 @@
         <w:rPr>
           <w:sz w:val="20"/>
         </w:rPr>
-        <w:t xml:space="preserve"> A new attack type cost 30 points of recall on it while the dashboard looked better. A hundred weighted labels recovered half of the loss.</w:t>
+        <w:t xml:space="preserve"> A new attack type cost 30 points of recall on it while the dashboard looked better. A hundred weighted labels recovered half of the loss, five hundred about 90%.</w:t>
       </w:r>
     </w:p>
     <w:p>
@@ -4547,7 +4560,20 @@
         <w:rPr>
           <w:sz w:val="20"/>
         </w:rPr>
-        <w:t xml:space="preserve">, 46% of the weight). We would deploy that model, with the BRB as a readable second opinion that sends undecided flows to an analyst, and with the monitoring of Part G.</w:t>
+        <w:t xml:space="preserve">, 46% of the weight). We would deploy that model rather than the original, but not trust it alone: the same attack search still makes </w:t>
+      </w:r>
+      <w:r>
+        <w:rPr>
+          <w:b/>
+          <w:sz w:val="20"/>
+        </w:rPr>
+        <w:t xml:space="preserve">34 of 50</w:t>
+      </w:r>
+      <w:r>
+        <w:rPr>
+          <w:sz w:val="20"/>
+        </w:rPr>
+        <w:t xml:space="preserve"> caught attacks look benign, with three or four cheap changes each (waiting about 10 ms longer between the attacker's own packets, padding them). We would run it with the BRB as a readable second opinion that sends undecided flows to an analyst, with the monitoring of Part G, and add features computed over many flows, which one attacker's timing cannot easily shape.</w:t>
       </w:r>
     </w:p>
     <w:p>
@@ -4568,7 +4594,7 @@
         <w:rPr>
           <w:sz w:val="20"/>
         </w:rPr>
-        <w:t xml:space="preserve"> Their own TCP settings: two system settings, at no cost to the attack, defeat all three models here. Removing those features is necessary; the behaviour features that remain are harder, but not impossible, to fake (timing and padding are cheap; the victim's replies are not).</w:t>
+        <w:t xml:space="preserve"> Their own TCP settings: one or two system settings, at no cost to the attack, defeat all three models here. Removing those features is necessary but not sufficient: the timing and padding that remain are also cheap to change, and fooled the model without them in two thirds of the attacks tried. Only the victim's replies are out of the attacker's reach; an unrestricted search evades by changing exactly those, which is why it overstates what a real attacker can do.</w:t>
       </w:r>
     </w:p>
     <w:p>

</xml_diff>

<commit_message>
H3: automatic number check of the report; wording fixes it found
</commit_message>
<xml_diff>
--- a/report/Mini_Project_Report.docx
+++ b/report/Mini_Project_Report.docx
@@ -1154,7 +1154,7 @@
         <w:rPr>
           <w:sz w:val="20"/>
         </w:rPr>
-        <w:t xml:space="preserve">). We chose boosting over a random forest for speed: on all training rows a 300-tree forest took about 8 minutes to train and SHAP on 300 flows over 12 minutes, against seconds for boosting, and every later part retrains or explains the black box many times.</w:t>
+        <w:t xml:space="preserve">). We chose boosting over a random forest for speed: in a trial run, a 300-tree forest on all training rows took about 8 minutes to train and SHAP on 300 flows over 12 minutes, against seconds for boosting, and every later part retrains or explains the black box many times.</w:t>
       </w:r>
     </w:p>
     <w:p>
@@ -3272,7 +3272,7 @@
         <w:rPr>
           <w:sz w:val="20"/>
         </w:rPr>
-        <w:t xml:space="preserve"> (1 to 2 of 3 shared features), and we tested four reasons. (1) LIME's quartile ranges put the attacker window 16,383 and the benign 5,792 into neighbouring ranges and the values 8 and 20 into one range, although the model treats them oppositely; without ranges and with samples drawn around the flow, LIME's top 3 for the detection became exactly SHAP's. (2) More samples (20,000 instead of 5,000) changed neither stability nor agreement. (3) Correlated twin features did not explain it: the differing features correlate at most 0.30. (4) </w:t>
+        <w:t xml:space="preserve"> (1 to 2 of 3 shared features), and we tested four reasons. (1) LIME's quartile ranges put the attacker window 16,383 and the benign 5,792 into neighbouring ranges and the values 8 and 20 into one range, although the model treats them oppositely; without ranges and with samples drawn around the flow, LIME's top 3 for the detection became exactly SHAP's. (2) More samples (20,000 instead of 5,000) improved neither stability nor agreement. (3) Correlated twin features did not explain it: the differing features correlate at most 0.30. (4) </w:t>
       </w:r>
       <w:r>
         <w:rPr>
@@ -4573,7 +4573,7 @@
         <w:rPr>
           <w:sz w:val="20"/>
         </w:rPr>
-        <w:t xml:space="preserve"> caught attacks look benign, with three or four cheap changes each (waiting about 10 ms longer between the attacker's own packets, padding them). We would run it with the BRB as a readable second opinion that sends undecided flows to an analyst, with the monitoring of Part G, and add features computed over many flows, which one attacker's timing cannot easily shape.</w:t>
+        <w:t xml:space="preserve"> caught attacks look benign, most with two or three cheap changes (waiting about 10 ms longer between the attacker's own packets, padding them). We would run it with the BRB as a readable second opinion that sends undecided flows to an analyst, with the monitoring of Part G, and add features computed over many flows, which one attacker's timing cannot easily shape.</w:t>
       </w:r>
     </w:p>
     <w:p>
@@ -4732,7 +4732,7 @@
         <w:rPr>
           <w:sz w:val="20"/>
         </w:rPr>
-        <w:t xml:space="preserve">The AI assistant Claude (Anthropic) [12], through the Claude Code tool, was used throughout the project: to compare candidate datasets, plan the work, explain concepts, write and review the notebook code, run the experiments, check numbers against the result tables, and draft and edit the text of the README and this report. The author made the project decisions (dataset, using all rows, which models, which extra checks) and is responsible for the content. All numbers come from the notebook's own output.</w:t>
+        <w:t xml:space="preserve">The AI assistant Claude (Anthropic) [12], through the Claude Code tool, was used throughout the project: to compare candidate datasets, plan the work, explain concepts, write and review the notebook code, run the experiments, check numbers against the result tables, and draft and edit the text of the README and this report. The author made the project decisions (dataset, using all rows, which models, which extra checks) and is responsible for the content. All results come from the output of the notebook and of the separate notebook of additional checks; only the timings in Section 2 and the choice of the hidden attack come from earlier trial runs.</w:t>
       </w:r>
     </w:p>
     <w:p>

</xml_diff>

<commit_message>
Two-person group: authors, who did what, presenters per slide
</commit_message>
<xml_diff>
--- a/report/Mini_Project_Report.docx
+++ b/report/Mini_Project_Report.docx
@@ -232,7 +232,7 @@
           <w:sz w:val="20"/>
           <w:szCs w:val="20"/>
         </w:rPr>
-        <w:t>One-person group</w:t>
+        <w:t>Group 6</w:t>
       </w:r>
     </w:p>
     <w:p>
@@ -268,7 +268,62 @@
           <w:sz w:val="20"/>
           <w:szCs w:val="20"/>
         </w:rPr>
-        <w:t>Author:</w:t>
+        <w:t>Authors:</w:t>
+      </w:r>
+      <w:r>
+        <w:br/>
+      </w:r>
+      <w:r>
+        <w:rPr>
+          <w:rFonts w:ascii="Aptos" w:hAnsi="Aptos" w:eastAsia="Aptos"/>
+          <w:b w:val="1"/>
+          <w:bCs w:val="1"/>
+          <w:i w:val="0"/>
+          <w:iCs w:val="0"/>
+          <w:color w:val="000000" w:themeColor="text1" w:themeTint="FF" w:themeShade="FF"/>
+          <w:sz w:val="20"/>
+          <w:szCs w:val="20"/>
+        </w:rPr>
+        <w:t>Kirill Silchenko</w:t>
+      </w:r>
+      <w:r>
+        <w:rPr>
+          <w:rFonts w:ascii="Aptos" w:hAnsi="Aptos" w:eastAsia="Aptos"/>
+          <w:b w:val="1"/>
+          <w:bCs w:val="1"/>
+          <w:i w:val="0"/>
+          <w:iCs w:val="0"/>
+          <w:color w:val="000000" w:themeColor="text1" w:themeTint="FF" w:themeShade="FF"/>
+          <w:sz w:val="20"/>
+          <w:szCs w:val="20"/>
+        </w:rPr>
+        <w:t xml:space="preserve"> </w:t>
+      </w:r>
+      <w:r>
+        <w:rPr>
+          <w:rFonts w:ascii="Aptos" w:hAnsi="Aptos" w:eastAsia="Aptos"/>
+          <w:b w:val="1"/>
+          <w:bCs w:val="1"/>
+          <w:i w:val="0"/>
+          <w:iCs w:val="0"/>
+          <w:color w:val="000000" w:themeColor="text1" w:themeTint="FF" w:themeShade="FF"/>
+          <w:sz w:val="20"/>
+          <w:szCs w:val="20"/>
+        </w:rPr>
+        <w:t>-</w:t>
+      </w:r>
+      <w:r>
+        <w:rPr>
+          <w:rFonts w:ascii="Aptos" w:hAnsi="Aptos" w:eastAsia="Aptos"/>
+          <w:b w:val="1"/>
+          <w:bCs w:val="1"/>
+          <w:i w:val="0"/>
+          <w:iCs w:val="0"/>
+          <w:color w:val="467886"/>
+          <w:sz w:val="20"/>
+          <w:szCs w:val="20"/>
+        </w:rPr>
+        <w:t xml:space="preserve"> kirsil-5@student.ltu.se</w:t>
       </w:r>
       <w:r>
         <w:br/>
@@ -4708,9 +4763,29 @@
       </w:pPr>
       <w:r>
         <w:rPr>
-          <w:sz w:val="20"/>
-        </w:rPr>
-        <w:t xml:space="preserve">Stefanos Ntentopoulos (one-person group): all of the work, namely choosing the dataset, the data cleaning and split, all models and experiments of Parts A to G, the notebook, the README and this report.</w:t>
+          <w:b/>
+          <w:sz w:val="20"/>
+        </w:rPr>
+        <w:t xml:space="preserve">Kirill Silchenko:</w:t>
+      </w:r>
+      <w:r>
+        <w:rPr>
+          <w:sz w:val="20"/>
+        </w:rPr>
+        <w:t xml:space="preserve"> the problem statement, loading and cleaning the data, the split and the trivial baseline (Part A), the decision tree, logistic regression and gradient boosting (Part B), and the belief rule base with its fair comparison (Part F). </w:t>
+      </w:r>
+      <w:r>
+        <w:rPr>
+          <w:b/>
+          <w:sz w:val="20"/>
+        </w:rPr>
+        <w:t xml:space="preserve">Stefanos Ntentopoulos:</w:t>
+      </w:r>
+      <w:r>
+        <w:rPr>
+          <w:sz w:val="20"/>
+        </w:rPr>
+        <w:t xml:space="preserve"> learning with fewer labels and pseudo-labelling (Part C), the SHAP and LIME explanations and their checks (Part D), noise, missing features and what an attacker could fake (Part E), and the hidden attack and its adaptation (Part G). Each member made the additional checks for their own parts. Both chose the dataset and wrote the notebook, the README and this report together.</w:t>
       </w:r>
     </w:p>
     <w:p>
@@ -4732,7 +4807,7 @@
         <w:rPr>
           <w:sz w:val="20"/>
         </w:rPr>
-        <w:t xml:space="preserve">The AI assistant Claude (Anthropic) [12], through the Claude Code tool, was used throughout the project: to compare candidate datasets, plan the work, explain concepts, write and review the notebook code, run the experiments, check numbers against the result tables, and draft and edit the text of the README and this report. The author made the project decisions (dataset, using all rows, which models, which extra checks) and is responsible for the content. All results come from the output of the notebook and of the separate notebook of additional checks; only the timings in Section 2 and the choice of the hidden attack come from earlier trial runs.</w:t>
+        <w:t xml:space="preserve">The AI assistant Claude (Anthropic) [12], through the Claude Code tool, was used throughout the project: to compare candidate datasets, plan the work, explain concepts, write and review the notebook code, run the experiments, check numbers against the result tables, and draft and edit the text of the README and this report. The authors made the project decisions (dataset, using all rows, which models, which extra checks) and are responsible for the content. All results come from the output of the notebook and of the separate notebook of additional checks; only the timings in Section 2 and the choice of the hidden attack come from earlier trial runs.</w:t>
       </w:r>
     </w:p>
     <w:p>

</xml_diff>

<commit_message>
Additional checks moved into the hand-in notebook; slow scoring cached, run 240 s
</commit_message>
<xml_diff>
--- a/report/Mini_Project_Report.docx
+++ b/report/Mini_Project_Report.docx
@@ -2408,7 +2408,7 @@
         <w:rPr>
           <w:sz w:val="20"/>
         </w:rPr>
-        <w:t xml:space="preserve">Every model is far above the baseline. Gradient boosting is best, but only just: 0.003 macro-F1 above the decision tree. Logistic regression catches the most attacks but raises the most false alarms (1,857 against 1,241 for boosting). Recall is at least 0.957 for every attack type and model; boosting's weakest large type is Fuzzers (0.988), which accounts for about half of the 124 attacks it misses. A paired bootstrap over the test flows (200 resamples, in the separate notebook of additional checks) gives 95% intervals of about ±0.002 on macro-F1, so the 0.003 lead over the tree is small but real.</w:t>
+        <w:t xml:space="preserve">Every model is far above the baseline. Gradient boosting is best, but only just: 0.003 macro-F1 above the decision tree. Logistic regression catches the most attacks but raises the most false alarms (1,857 against 1,241 for boosting). Recall is at least 0.957 for every attack type and model; boosting's weakest large type is Fuzzers (0.988), which accounts for about half of the 124 attacks it misses. A paired bootstrap over the test flows (200 resamples, among the additional checks at the end of the notebook) gives 95% intervals of about ±0.002 on macro-F1, so the 0.003 lead over the tree is small but real.</w:t>
       </w:r>
     </w:p>
     <w:p>
@@ -4175,7 +4175,7 @@
         <w:rPr>
           <w:sz w:val="20"/>
         </w:rPr>
-        <w:t xml:space="preserve">, 0.011 for the tree and 0.066 for logistic regression. A greedy attack search in the separate notebook, allowed only changes the attacker controls, needs even less: one change to </w:t>
+        <w:t xml:space="preserve">, 0.011 for the tree and 0.066 for logistic regression. A greedy attack search at the end of the notebook, allowed only changes the attacker controls, needs even less: one change to </w:t>
       </w:r>
       <w:r>
         <w:rPr>
@@ -4400,7 +4400,7 @@
         <w:rPr>
           <w:sz w:val="20"/>
         </w:rPr>
-        <w:t xml:space="preserve">. We would watch the share of uncertain predictions (it nearly doubled here, and needs no labels), compare incoming feature distributions with the training data, have analysts label a small random sample every week (including flows called benign), and retrain regularly. A learning curve in the separate notebook shows how far labels go: 500 labels weighted 100 times reach 0.956 (FAR 0.027, the original model's level), and 25 weighted labels already beat 250 unweighted ones.</w:t>
+        <w:t xml:space="preserve">. We would watch the share of uncertain predictions (it nearly doubled here, and needs no labels), compare incoming feature distributions with the training data, have analysts label a small random sample every week (including flows called benign), and retrain regularly. A learning curve at the end of the notebook shows how far labels go: 500 labels weighted 100 times reach 0.956 (FAR 0.027, the original model's level), and 25 weighted labels already beat 250 unweighted ones.</w:t>
       </w:r>
     </w:p>
     <w:p>
@@ -4560,7 +4560,7 @@
         <w:rPr>
           <w:sz w:val="20"/>
         </w:rPr>
-        <w:t xml:space="preserve"> missing, Unknown rose to 0.43 and the utility became a range, 16.9 to 59.6, that spans the threshold: the honest answer "cannot decide". It also survives noise far better: at noise 0.05 its macro-F1 is 0.897, against 0.472 for the 2-feature tree and 0.536 for the forest. The costs: lower accuracy, only two features (rules grow as 3 to the power of the number of features), hand-made choices of levels and threshold, and an Unknown that only helps if undecided flows go to an analyst. On the whole test set (separate notebook), a missing window leaves the BRB unable to decide 65% of the flows, while boosting, given the median instead, misses 79% of the attacks with no sign of doubt.</w:t>
+        <w:t xml:space="preserve"> missing, Unknown rose to 0.43 and the utility became a range, 16.9 to 59.6, that spans the threshold: the honest answer "cannot decide". It also survives noise far better: at noise 0.05 its macro-F1 is 0.897, against 0.472 for the 2-feature tree and 0.536 for the forest. The costs: lower accuracy, only two features (rules grow as 3 to the power of the number of features), hand-made choices of levels and threshold, and an Unknown that only helps if undecided flows go to an analyst. On the whole test set (an additional check), a missing window leaves the BRB unable to decide 65% of the flows, while boosting, given the median instead, misses 79% of the attacks with no sign of doubt.</w:t>
       </w:r>
     </w:p>
     <w:p>
@@ -4602,7 +4602,7 @@
         <w:rPr>
           <w:sz w:val="20"/>
         </w:rPr>
-        <w:t xml:space="preserve"> Not as it is. On this dataset it is excellent, but its accuracy rests on recognising a few attacker machines, which says nothing about attackers elsewhere. An additional check (separate notebook) trained boosting without the three TCP-settings features: test macro-F1 0.971 instead of 0.972, recall at noise 0.001 0.831 instead of 0.513, and a SHAP ranking led by behaviour features (</w:t>
+        <w:t xml:space="preserve"> Not as it is. On this dataset it is excellent, but its accuracy rests on recognising a few attacker machines, which says nothing about attackers elsewhere. An additional check (at the end of the notebook) trained boosting without the three TCP-settings features: test macro-F1 0.971 instead of 0.972, recall at noise 0.001 0.831 instead of 0.513, and a SHAP ranking led by behaviour features (</w:t>
       </w:r>
       <w:r>
         <w:rPr>
@@ -4807,7 +4807,7 @@
         <w:rPr>
           <w:sz w:val="20"/>
         </w:rPr>
-        <w:t xml:space="preserve">The AI assistant Claude (Anthropic) [12], through the Claude Code tool, was used throughout the project: to compare candidate datasets, plan the work, explain concepts, write and review the notebook code, run the experiments, check numbers against the result tables, and draft and edit the text of the README and this report. The authors made the project decisions (dataset, using all rows, which models, which extra checks) and are responsible for the content. All results come from the output of the notebook and of the separate notebook of additional checks; only the timings in Section 2 and the choice of the hidden attack come from earlier trial runs.</w:t>
+        <w:t xml:space="preserve">The AI assistant Claude (Anthropic) [12], through the Claude Code tool, was used throughout the project: to compare candidate datasets, plan the work, explain concepts, write and review the notebook code, run the experiments, check numbers against the result tables, and draft and edit the text of the README and this report. The authors made the project decisions (dataset, using all rows, which models, which extra checks) and are responsible for the content. All results come from the output of the notebook; only the timings in Section 2 and the choice of the hidden attack come from earlier trial runs.</w:t>
       </w:r>
     </w:p>
     <w:p>

</xml_diff>

<commit_message>
Two-phase notebook: every setting chosen on validation before the test set is opened
</commit_message>
<xml_diff>
--- a/report/Mini_Project_Report.docx
+++ b/report/Mini_Project_Report.docx
@@ -567,7 +567,7 @@
         <w:rPr>
           <w:sz w:val="20"/>
         </w:rPr>
-        <w:t xml:space="preserve"> All settings were chosen on the validation set; the test set was then used once. Table 1 shows that the two agree to within 0.003 on every score, so the settings were not tuned too closely to the validation set.</w:t>
+        <w:t xml:space="preserve"> All settings were chosen on the validation set before the test set was opened: the notebook first makes every choice with the test set sealed, then opens it and only reports results on it (see Method). Table 1 shows that the two agree to within 0.003 on every score, so the settings were not tuned too closely to the validation set.</w:t>
       </w:r>
     </w:p>
     <w:tbl>
@@ -1244,6 +1244,27 @@
           <w:sz w:val="20"/>
         </w:rPr>
         <w:t xml:space="preserve"> from {0.01, 0.1, 1, 10}: 10. Boosting learning rate {0.05, 0.1} by leaves per tree {31, 63}: 0.1 and 31. All four boosting settings were within 0.001 macro-F1 of each other, so the choice matters little.</w:t>
+      </w:r>
+    </w:p>
+    <w:p>
+      <w:pPr>
+        <w:spacing w:after="120"/>
+        <w:rPr>
+          <w:sz w:val="20"/>
+        </w:rPr>
+      </w:pPr>
+      <w:r>
+        <w:rPr>
+          <w:b/>
+          <w:sz w:val="20"/>
+        </w:rPr>
+        <w:t xml:space="preserve">The test set is held back until every setting is fixed.</w:t>
+      </w:r>
+      <w:r>
+        <w:rPr>
+          <w:sz w:val="20"/>
+        </w:rPr>
+        <w:t xml:space="preserve"> The notebook runs in two phases. The first chooses every setting on the validation set: the three models (above), the pseudo-labelling cutoffs (Part C and the additional check with fewer labels), the BRB's features and threshold, and the depth of the tree on the BRB's features (Part F). During this phase the test set is sealed: only its size and the class balance of the split are known, and any cell that used it would stop with an error. Then the test set is opened, and the second phase only reports results on it and chooses nothing. Every test score in this report comes from that second phase.</w:t>
       </w:r>
     </w:p>
     <w:p>

</xml_diff>